<commit_message>
Add RESTful Web API system, update KhanetBook branding, and sync project documentation
</commit_message>
<xml_diff>
--- a/Django_Ebook_Store_Project_Report.docx
+++ b/Django_Ebook_Store_Project_Report.docx
@@ -9642,7 +9642,7 @@
                 <w:sz w:val="29"/>
                 <w:rFonts w:ascii="TH Sarabun New" w:hAnsi="TH Sarabun New" w:cs="TH Sarabun New"/>
               </w:rPr>
-              <w:t>Dark Mode Theme</w:t>
+              <w:t>RESTful JSON API</w:t>
             </w:r>
           </w:p>
         </w:tc>
@@ -9669,7 +9669,7 @@
                 <w:sz w:val="29"/>
                 <w:rFonts w:ascii="TH Sarabun New" w:hAnsi="TH Sarabun New" w:cs="TH Sarabun New"/>
               </w:rPr>
-              <w:t>ออกแบบสไตล์ Dark Theme สมบูรณ์แบบ คอนทราสต์สูง (#0b0f19, #151c2c, ตัวหนังสือขาว #ffffff, ราคาฟ้าสดใส #38bdf8) สบายตาและสวยงาม</w:t>
+              <w:t>ระบบ Web API ครบวงจร (/api/books/, /api/categories/, /api/cart/, /api/seller/dashboard/, /api/health/) พร้อมหน้าเอกสารทดสอบ API สด (/api/docs/) ตอบกลับ JSON มาตรฐาน</w:t>
             </w:r>
           </w:p>
         </w:tc>
@@ -9699,7 +9699,7 @@
                 <w:sz w:val="29"/>
                 <w:rFonts w:ascii="TH Sarabun New" w:hAnsi="TH Sarabun New" w:cs="TH Sarabun New"/>
               </w:rPr>
-              <w:t>Seller Sales Dashboard</w:t>
+              <w:t>Dark Mode Theme</w:t>
             </w:r>
           </w:p>
         </w:tc>
@@ -9727,7 +9727,7 @@
                 <w:sz w:val="29"/>
                 <w:rFonts w:ascii="TH Sarabun New" w:hAnsi="TH Sarabun New" w:cs="TH Sarabun New"/>
               </w:rPr>
-              <w:t>หน้า /seller/dashboard/ คำนวณสรุปยอดขายรวม (Sum), จำนวนเล่มที่ขายได้ (Count) และรายชื่อหนังสือในคลังของผู้ขาย</w:t>
+              <w:t>ออกแบบสไตล์ Dark Theme สมบูรณ์แบบ คอนทราสต์สูง (#0b0f19, #151c2c, ตัวหนังสือขาว #ffffff, ราคาฟ้าสดใส #38bdf8) สบายตาและสวยงาม</w:t>
             </w:r>
           </w:p>
         </w:tc>
@@ -9756,7 +9756,7 @@
                 <w:sz w:val="29"/>
                 <w:rFonts w:ascii="TH Sarabun New" w:hAnsi="TH Sarabun New" w:cs="TH Sarabun New"/>
               </w:rPr>
-              <w:t>Digital Rights File Guard</w:t>
+              <w:t>Seller Sales Dashboard</w:t>
             </w:r>
           </w:p>
         </w:tc>
@@ -9783,7 +9783,7 @@
                 <w:sz w:val="29"/>
                 <w:rFonts w:ascii="TH Sarabun New" w:hAnsi="TH Sarabun New" w:cs="TH Sarabun New"/>
               </w:rPr>
-              <w:t>ระบบป้องกันดาวน์โหลดไฟล์ตรง ตรวจสอบสิทธิ์การชำระเงินจริงในตาราง OrderItem ก่อนส่งไฟล์ผ่าน FileResponse</w:t>
+              <w:t>หน้า /seller/dashboard/ คำนวณสรุปยอดขายรวม (Sum), จำนวนเล่มที่ขายได้ (Count) และรายชื่อหนังสือในคลังของผู้ขาย</w:t>
             </w:r>
           </w:p>
         </w:tc>
@@ -9813,7 +9813,7 @@
                 <w:sz w:val="29"/>
                 <w:rFonts w:ascii="TH Sarabun New" w:hAnsi="TH Sarabun New" w:cs="TH Sarabun New"/>
               </w:rPr>
-              <w:t>Sample Preview System</w:t>
+              <w:t>Digital Rights File Guard</w:t>
             </w:r>
           </w:p>
         </w:tc>
@@ -9841,7 +9841,7 @@
                 <w:sz w:val="29"/>
                 <w:rFonts w:ascii="TH Sarabun New" w:hAnsi="TH Sarabun New" w:cs="TH Sarabun New"/>
               </w:rPr>
-              <w:t>ระบบเปิดไฟล์ตัวอย่างอ่านฟรี (Sample PDF) ให้ลูกค้าตัดสินใจก่อนซื้อ โดยเปิดแท็บใหม่บนเบราว์เซอร์ได้ทันที</w:t>
+              <w:t>ระบบป้องกันดาวน์โหลดไฟล์ตรง ตรวจสอบสิทธิ์การชำระเงินจริงในตาราง OrderItem ก่อนส่งไฟล์ผ่าน FileResponse</w:t>
             </w:r>
           </w:p>
         </w:tc>
@@ -9870,7 +9870,7 @@
                 <w:sz w:val="29"/>
                 <w:rFonts w:ascii="TH Sarabun New" w:hAnsi="TH Sarabun New" w:cs="TH Sarabun New"/>
               </w:rPr>
-              <w:t>Context Processor Cart</w:t>
+              <w:t>Sample Preview System</w:t>
             </w:r>
           </w:p>
         </w:tc>
@@ -9897,7 +9897,7 @@
                 <w:sz w:val="29"/>
                 <w:rFonts w:ascii="TH Sarabun New" w:hAnsi="TH Sarabun New" w:cs="TH Sarabun New"/>
               </w:rPr>
-              <w:t>ระบบคำนวณจำนวนหนังสือในตะกร้าและส่งให้ทุกเทมเพลตอัตโนมัติ เพื่อแสดง Badge ตัวเลขบนแถบนำทาง Navbar</w:t>
+              <w:t>ระบบเปิดไฟล์ตัวอย่างอ่านฟรี (Sample PDF) ให้ลูกค้าตัดสินใจก่อนซื้อ โดยเปิดแท็บใหม่บนเบราว์เซอร์ได้ทันที</w:t>
             </w:r>
           </w:p>
         </w:tc>
@@ -9927,7 +9927,7 @@
                 <w:sz w:val="29"/>
                 <w:rFonts w:ascii="TH Sarabun New" w:hAnsi="TH Sarabun New" w:cs="TH Sarabun New"/>
               </w:rPr>
-              <w:t>Automated Testing</w:t>
+              <w:t>Context Processor Cart</w:t>
             </w:r>
           </w:p>
         </w:tc>
@@ -9955,7 +9955,63 @@
                 <w:sz w:val="29"/>
                 <w:rFonts w:ascii="TH Sarabun New" w:hAnsi="TH Sarabun New" w:cs="TH Sarabun New"/>
               </w:rPr>
-              <w:t>ชุดทดสอบอัตโนมัติ 4 การทดสอบใน books/tests.py ครอบคลุม Catalog, RBAC, Validation, Flow</w:t>
+              <w:t>ระบบคำนวณจำนวนหนังสือในตะกร้าและส่งให้ทุกเทมเพลตอัตโนมัติ เพื่อแสดง Badge ตัวเลขบนแถบนำทาง Navbar</w:t>
+            </w:r>
+          </w:p>
+        </w:tc>
+      </w:tr>
+      <w:tr>
+        <w:tc>
+          <w:tcPr>
+            <w:tcW w:type="dxa" w:w="2880"/>
+            <w:tcMar>
+              <w:top w:w="120" w:type="dxa"/>
+              <w:bottom w:w="120" w:type="dxa"/>
+              <w:left w:w="140" w:type="dxa"/>
+              <w:right w:w="140" w:type="dxa"/>
+            </w:tcMar>
+          </w:tcPr>
+          <w:p>
+            <w:pPr>
+              <w:spacing w:before="0" w:after="0" w:line="276" w:lineRule="auto"/>
+            </w:pPr>
+            <w:r>
+              <w:rPr>
+                <w:rFonts w:ascii="TH Sarabun New" w:hAnsi="TH Sarabun New"/>
+                <w:b w:val="0"/>
+                <w:i w:val="0"/>
+                <w:color w:val="1E293B"/>
+                <w:sz w:val="29"/>
+                <w:rFonts w:ascii="TH Sarabun New" w:hAnsi="TH Sarabun New" w:cs="TH Sarabun New"/>
+              </w:rPr>
+              <w:t>Automated Testing</w:t>
+            </w:r>
+          </w:p>
+        </w:tc>
+        <w:tc>
+          <w:tcPr>
+            <w:tcW w:type="dxa" w:w="6480"/>
+            <w:tcMar>
+              <w:top w:w="120" w:type="dxa"/>
+              <w:bottom w:w="120" w:type="dxa"/>
+              <w:left w:w="140" w:type="dxa"/>
+              <w:right w:w="140" w:type="dxa"/>
+            </w:tcMar>
+          </w:tcPr>
+          <w:p>
+            <w:pPr>
+              <w:spacing w:before="0" w:after="0" w:line="276" w:lineRule="auto"/>
+            </w:pPr>
+            <w:r>
+              <w:rPr>
+                <w:rFonts w:ascii="TH Sarabun New" w:hAnsi="TH Sarabun New"/>
+                <w:b w:val="0"/>
+                <w:i w:val="0"/>
+                <w:color w:val="1E293B"/>
+                <w:sz w:val="29"/>
+                <w:rFonts w:ascii="TH Sarabun New" w:hAnsi="TH Sarabun New" w:cs="TH Sarabun New"/>
+              </w:rPr>
+              <w:t>ชุดทดสอบอัตโนมัติ 11 การทดสอบใน books/tests.py และ api/tests.py ครอบคลุมทั้งระบบและ API</w:t>
             </w:r>
           </w:p>
         </w:tc>
@@ -11532,7 +11588,7 @@
           <w:sz w:val="30"/>
           <w:rFonts w:ascii="TH Sarabun New" w:hAnsi="TH Sarabun New" w:cs="TH Sarabun New"/>
         </w:rPr>
-        <w:t>ชุดทดสอบอัตโนมัติพัฒนาใน books/tests.py โดยรันด้วยคำสั่ง `python manage.py test` ประกอบด้วย 4 กรณีทดสอบสำคัญ ซึ่งผ่านการทดสอบทั้งหมด (OK) ดังนี้</w:t>
+        <w:t>ชุดทดสอบอัตโนมัติพัฒนาใน books/tests.py และ api/tests.py โดยรันด้วยคำสั่ง `python manage.py test` ประกอบด้วย 11 กรณีทดสอบสำคัญ ครอบคลุมการทำงานของระบบหลักและ Web API ซึ่งผ่านการทดสอบทั้งหมด (OK) ดังนี้</w:t>
       </w:r>
     </w:p>
     <w:tbl>
@@ -11836,6 +11892,404 @@
                 <w:rFonts w:ascii="TH Sarabun New" w:hAnsi="TH Sarabun New" w:cs="TH Sarabun New"/>
               </w:rPr>
               <w:t>ทดสอบขั้นตอนสั่งซื้อตั้งแต่เพิ่มลงตะกร้า ทำการ Checkout สร้าง Order/OrderItem และหนังสือต้องเข้า My Library</w:t>
+            </w:r>
+          </w:p>
+        </w:tc>
+      </w:tr>
+      <w:tr>
+        <w:tc>
+          <w:tcPr>
+            <w:tcW w:type="dxa" w:w="3312"/>
+            <w:tcMar>
+              <w:top w:w="120" w:type="dxa"/>
+              <w:bottom w:w="120" w:type="dxa"/>
+              <w:left w:w="140" w:type="dxa"/>
+              <w:right w:w="140" w:type="dxa"/>
+            </w:tcMar>
+          </w:tcPr>
+          <w:p>
+            <w:pPr>
+              <w:spacing w:before="0" w:after="0" w:line="276" w:lineRule="auto"/>
+            </w:pPr>
+            <w:r>
+              <w:rPr>
+                <w:rFonts w:ascii="TH Sarabun New" w:hAnsi="TH Sarabun New"/>
+                <w:b w:val="0"/>
+                <w:i w:val="0"/>
+                <w:color w:val="1E293B"/>
+                <w:sz w:val="29"/>
+                <w:rFonts w:ascii="TH Sarabun New" w:hAnsi="TH Sarabun New" w:cs="TH Sarabun New"/>
+              </w:rPr>
+              <w:t>test_api_docs_html_and_json</w:t>
+            </w:r>
+          </w:p>
+        </w:tc>
+        <w:tc>
+          <w:tcPr>
+            <w:tcW w:type="dxa" w:w="6048"/>
+            <w:tcMar>
+              <w:top w:w="120" w:type="dxa"/>
+              <w:bottom w:w="120" w:type="dxa"/>
+              <w:left w:w="140" w:type="dxa"/>
+              <w:right w:w="140" w:type="dxa"/>
+            </w:tcMar>
+          </w:tcPr>
+          <w:p>
+            <w:pPr>
+              <w:spacing w:before="0" w:after="0" w:line="276" w:lineRule="auto"/>
+            </w:pPr>
+            <w:r>
+              <w:rPr>
+                <w:rFonts w:ascii="TH Sarabun New" w:hAnsi="TH Sarabun New"/>
+                <w:b w:val="0"/>
+                <w:i w:val="0"/>
+                <w:color w:val="1E293B"/>
+                <w:sz w:val="29"/>
+                <w:rFonts w:ascii="TH Sarabun New" w:hAnsi="TH Sarabun New" w:cs="TH Sarabun New"/>
+              </w:rPr>
+              <w:t>ทดสอบ Web API Docs แสดงผล HTML แบบอินเตอร์แอคทีฟ และส่งออกสเปก JSON ได้ถูกต้อง</w:t>
+            </w:r>
+          </w:p>
+        </w:tc>
+      </w:tr>
+      <w:tr>
+        <w:tc>
+          <w:tcPr>
+            <w:tcW w:type="dxa" w:w="3312"/>
+            <w:shd w:fill="FAFAFA"/>
+            <w:tcMar>
+              <w:top w:w="120" w:type="dxa"/>
+              <w:bottom w:w="120" w:type="dxa"/>
+              <w:left w:w="140" w:type="dxa"/>
+              <w:right w:w="140" w:type="dxa"/>
+            </w:tcMar>
+          </w:tcPr>
+          <w:p>
+            <w:pPr>
+              <w:spacing w:before="0" w:after="0" w:line="276" w:lineRule="auto"/>
+            </w:pPr>
+            <w:r>
+              <w:rPr>
+                <w:rFonts w:ascii="TH Sarabun New" w:hAnsi="TH Sarabun New"/>
+                <w:b w:val="0"/>
+                <w:i w:val="0"/>
+                <w:color w:val="1E293B"/>
+                <w:sz w:val="29"/>
+                <w:rFonts w:ascii="TH Sarabun New" w:hAnsi="TH Sarabun New" w:cs="TH Sarabun New"/>
+              </w:rPr>
+              <w:t>test_books_api_list_and_search</w:t>
+            </w:r>
+          </w:p>
+        </w:tc>
+        <w:tc>
+          <w:tcPr>
+            <w:tcW w:type="dxa" w:w="6048"/>
+            <w:shd w:fill="FAFAFA"/>
+            <w:tcMar>
+              <w:top w:w="120" w:type="dxa"/>
+              <w:bottom w:w="120" w:type="dxa"/>
+              <w:left w:w="140" w:type="dxa"/>
+              <w:right w:w="140" w:type="dxa"/>
+            </w:tcMar>
+          </w:tcPr>
+          <w:p>
+            <w:pPr>
+              <w:spacing w:before="0" w:after="0" w:line="276" w:lineRule="auto"/>
+            </w:pPr>
+            <w:r>
+              <w:rPr>
+                <w:rFonts w:ascii="TH Sarabun New" w:hAnsi="TH Sarabun New"/>
+                <w:b w:val="0"/>
+                <w:i w:val="0"/>
+                <w:color w:val="1E293B"/>
+                <w:sz w:val="29"/>
+                <w:rFonts w:ascii="TH Sarabun New" w:hAnsi="TH Sarabun New" w:cs="TH Sarabun New"/>
+              </w:rPr>
+              <w:t>ทดสอบ /api/books/ ส่งข้อมูล JSON รายการหนังสือ, Pagination และค้นหาแบบ Real-time</w:t>
+            </w:r>
+          </w:p>
+        </w:tc>
+      </w:tr>
+      <w:tr>
+        <w:tc>
+          <w:tcPr>
+            <w:tcW w:type="dxa" w:w="3312"/>
+            <w:tcMar>
+              <w:top w:w="120" w:type="dxa"/>
+              <w:bottom w:w="120" w:type="dxa"/>
+              <w:left w:w="140" w:type="dxa"/>
+              <w:right w:w="140" w:type="dxa"/>
+            </w:tcMar>
+          </w:tcPr>
+          <w:p>
+            <w:pPr>
+              <w:spacing w:before="0" w:after="0" w:line="276" w:lineRule="auto"/>
+            </w:pPr>
+            <w:r>
+              <w:rPr>
+                <w:rFonts w:ascii="TH Sarabun New" w:hAnsi="TH Sarabun New"/>
+                <w:b w:val="0"/>
+                <w:i w:val="0"/>
+                <w:color w:val="1E293B"/>
+                <w:sz w:val="29"/>
+                <w:rFonts w:ascii="TH Sarabun New" w:hAnsi="TH Sarabun New" w:cs="TH Sarabun New"/>
+              </w:rPr>
+              <w:t>test_book_detail_api</w:t>
+            </w:r>
+          </w:p>
+        </w:tc>
+        <w:tc>
+          <w:tcPr>
+            <w:tcW w:type="dxa" w:w="6048"/>
+            <w:tcMar>
+              <w:top w:w="120" w:type="dxa"/>
+              <w:bottom w:w="120" w:type="dxa"/>
+              <w:left w:w="140" w:type="dxa"/>
+              <w:right w:w="140" w:type="dxa"/>
+            </w:tcMar>
+          </w:tcPr>
+          <w:p>
+            <w:pPr>
+              <w:spacing w:before="0" w:after="0" w:line="276" w:lineRule="auto"/>
+            </w:pPr>
+            <w:r>
+              <w:rPr>
+                <w:rFonts w:ascii="TH Sarabun New" w:hAnsi="TH Sarabun New"/>
+                <w:b w:val="0"/>
+                <w:i w:val="0"/>
+                <w:color w:val="1E293B"/>
+                <w:sz w:val="29"/>
+                <w:rFonts w:ascii="TH Sarabun New" w:hAnsi="TH Sarabun New" w:cs="TH Sarabun New"/>
+              </w:rPr>
+              <w:t>ทดสอบ /api/books/&lt;id&gt;/ ส่งคืนรายละเอียดหนังสือเล่มเดี่ยว และคืนค่า 404 เมื่อไม่พบ</w:t>
+            </w:r>
+          </w:p>
+        </w:tc>
+      </w:tr>
+      <w:tr>
+        <w:tc>
+          <w:tcPr>
+            <w:tcW w:type="dxa" w:w="3312"/>
+            <w:shd w:fill="FAFAFA"/>
+            <w:tcMar>
+              <w:top w:w="120" w:type="dxa"/>
+              <w:bottom w:w="120" w:type="dxa"/>
+              <w:left w:w="140" w:type="dxa"/>
+              <w:right w:w="140" w:type="dxa"/>
+            </w:tcMar>
+          </w:tcPr>
+          <w:p>
+            <w:pPr>
+              <w:spacing w:before="0" w:after="0" w:line="276" w:lineRule="auto"/>
+            </w:pPr>
+            <w:r>
+              <w:rPr>
+                <w:rFonts w:ascii="TH Sarabun New" w:hAnsi="TH Sarabun New"/>
+                <w:b w:val="0"/>
+                <w:i w:val="0"/>
+                <w:color w:val="1E293B"/>
+                <w:sz w:val="29"/>
+                <w:rFonts w:ascii="TH Sarabun New" w:hAnsi="TH Sarabun New" w:cs="TH Sarabun New"/>
+              </w:rPr>
+              <w:t>test_category_api</w:t>
+            </w:r>
+          </w:p>
+        </w:tc>
+        <w:tc>
+          <w:tcPr>
+            <w:tcW w:type="dxa" w:w="6048"/>
+            <w:shd w:fill="FAFAFA"/>
+            <w:tcMar>
+              <w:top w:w="120" w:type="dxa"/>
+              <w:bottom w:w="120" w:type="dxa"/>
+              <w:left w:w="140" w:type="dxa"/>
+              <w:right w:w="140" w:type="dxa"/>
+            </w:tcMar>
+          </w:tcPr>
+          <w:p>
+            <w:pPr>
+              <w:spacing w:before="0" w:after="0" w:line="276" w:lineRule="auto"/>
+            </w:pPr>
+            <w:r>
+              <w:rPr>
+                <w:rFonts w:ascii="TH Sarabun New" w:hAnsi="TH Sarabun New"/>
+                <w:b w:val="0"/>
+                <w:i w:val="0"/>
+                <w:color w:val="1E293B"/>
+                <w:sz w:val="29"/>
+                <w:rFonts w:ascii="TH Sarabun New" w:hAnsi="TH Sarabun New" w:cs="TH Sarabun New"/>
+              </w:rPr>
+              <w:t>ทดสอบ /api/categories/ ส่งรายการหมวดหมู่และจำนวนหนังสือในแต่ละหมวด</w:t>
+            </w:r>
+          </w:p>
+        </w:tc>
+      </w:tr>
+      <w:tr>
+        <w:tc>
+          <w:tcPr>
+            <w:tcW w:type="dxa" w:w="3312"/>
+            <w:tcMar>
+              <w:top w:w="120" w:type="dxa"/>
+              <w:bottom w:w="120" w:type="dxa"/>
+              <w:left w:w="140" w:type="dxa"/>
+              <w:right w:w="140" w:type="dxa"/>
+            </w:tcMar>
+          </w:tcPr>
+          <w:p>
+            <w:pPr>
+              <w:spacing w:before="0" w:after="0" w:line="276" w:lineRule="auto"/>
+            </w:pPr>
+            <w:r>
+              <w:rPr>
+                <w:rFonts w:ascii="TH Sarabun New" w:hAnsi="TH Sarabun New"/>
+                <w:b w:val="0"/>
+                <w:i w:val="0"/>
+                <w:color w:val="1E293B"/>
+                <w:sz w:val="29"/>
+                <w:rFonts w:ascii="TH Sarabun New" w:hAnsi="TH Sarabun New" w:cs="TH Sarabun New"/>
+              </w:rPr>
+              <w:t>test_cart_api_operations</w:t>
+            </w:r>
+          </w:p>
+        </w:tc>
+        <w:tc>
+          <w:tcPr>
+            <w:tcW w:type="dxa" w:w="6048"/>
+            <w:tcMar>
+              <w:top w:w="120" w:type="dxa"/>
+              <w:bottom w:w="120" w:type="dxa"/>
+              <w:left w:w="140" w:type="dxa"/>
+              <w:right w:w="140" w:type="dxa"/>
+            </w:tcMar>
+          </w:tcPr>
+          <w:p>
+            <w:pPr>
+              <w:spacing w:before="0" w:after="0" w:line="276" w:lineRule="auto"/>
+            </w:pPr>
+            <w:r>
+              <w:rPr>
+                <w:rFonts w:ascii="TH Sarabun New" w:hAnsi="TH Sarabun New"/>
+                <w:b w:val="0"/>
+                <w:i w:val="0"/>
+                <w:color w:val="1E293B"/>
+                <w:sz w:val="29"/>
+                <w:rFonts w:ascii="TH Sarabun New" w:hAnsi="TH Sarabun New" w:cs="TH Sarabun New"/>
+              </w:rPr>
+              <w:t>ทดสอบ /api/cart/ และการเพิ่ม/ลบหนังสือในตะกร้าผ่าน API</w:t>
+            </w:r>
+          </w:p>
+        </w:tc>
+      </w:tr>
+      <w:tr>
+        <w:tc>
+          <w:tcPr>
+            <w:tcW w:type="dxa" w:w="3312"/>
+            <w:shd w:fill="FAFAFA"/>
+            <w:tcMar>
+              <w:top w:w="120" w:type="dxa"/>
+              <w:bottom w:w="120" w:type="dxa"/>
+              <w:left w:w="140" w:type="dxa"/>
+              <w:right w:w="140" w:type="dxa"/>
+            </w:tcMar>
+          </w:tcPr>
+          <w:p>
+            <w:pPr>
+              <w:spacing w:before="0" w:after="0" w:line="276" w:lineRule="auto"/>
+            </w:pPr>
+            <w:r>
+              <w:rPr>
+                <w:rFonts w:ascii="TH Sarabun New" w:hAnsi="TH Sarabun New"/>
+                <w:b w:val="0"/>
+                <w:i w:val="0"/>
+                <w:color w:val="1E293B"/>
+                <w:sz w:val="29"/>
+                <w:rFonts w:ascii="TH Sarabun New" w:hAnsi="TH Sarabun New" w:cs="TH Sarabun New"/>
+              </w:rPr>
+              <w:t>test_seller_dashboard_api_security</w:t>
+            </w:r>
+          </w:p>
+        </w:tc>
+        <w:tc>
+          <w:tcPr>
+            <w:tcW w:type="dxa" w:w="6048"/>
+            <w:shd w:fill="FAFAFA"/>
+            <w:tcMar>
+              <w:top w:w="120" w:type="dxa"/>
+              <w:bottom w:w="120" w:type="dxa"/>
+              <w:left w:w="140" w:type="dxa"/>
+              <w:right w:w="140" w:type="dxa"/>
+            </w:tcMar>
+          </w:tcPr>
+          <w:p>
+            <w:pPr>
+              <w:spacing w:before="0" w:after="0" w:line="276" w:lineRule="auto"/>
+            </w:pPr>
+            <w:r>
+              <w:rPr>
+                <w:rFonts w:ascii="TH Sarabun New" w:hAnsi="TH Sarabun New"/>
+                <w:b w:val="0"/>
+                <w:i w:val="0"/>
+                <w:color w:val="1E293B"/>
+                <w:sz w:val="29"/>
+                <w:rFonts w:ascii="TH Sarabun New" w:hAnsi="TH Sarabun New" w:cs="TH Sarabun New"/>
+              </w:rPr>
+              <w:t>ทดสอบการป้องกันสิทธิ์บน /api/seller/dashboard/ ไม่อนุญาตบุคคลภายนอก (401) และลูกค้า (403)</w:t>
+            </w:r>
+          </w:p>
+        </w:tc>
+      </w:tr>
+      <w:tr>
+        <w:tc>
+          <w:tcPr>
+            <w:tcW w:type="dxa" w:w="3312"/>
+            <w:tcMar>
+              <w:top w:w="120" w:type="dxa"/>
+              <w:bottom w:w="120" w:type="dxa"/>
+              <w:left w:w="140" w:type="dxa"/>
+              <w:right w:w="140" w:type="dxa"/>
+            </w:tcMar>
+          </w:tcPr>
+          <w:p>
+            <w:pPr>
+              <w:spacing w:before="0" w:after="0" w:line="276" w:lineRule="auto"/>
+            </w:pPr>
+            <w:r>
+              <w:rPr>
+                <w:rFonts w:ascii="TH Sarabun New" w:hAnsi="TH Sarabun New"/>
+                <w:b w:val="0"/>
+                <w:i w:val="0"/>
+                <w:color w:val="1E293B"/>
+                <w:sz w:val="29"/>
+                <w:rFonts w:ascii="TH Sarabun New" w:hAnsi="TH Sarabun New" w:cs="TH Sarabun New"/>
+              </w:rPr>
+              <w:t>test_health_api</w:t>
+            </w:r>
+          </w:p>
+        </w:tc>
+        <w:tc>
+          <w:tcPr>
+            <w:tcW w:type="dxa" w:w="6048"/>
+            <w:tcMar>
+              <w:top w:w="120" w:type="dxa"/>
+              <w:bottom w:w="120" w:type="dxa"/>
+              <w:left w:w="140" w:type="dxa"/>
+              <w:right w:w="140" w:type="dxa"/>
+            </w:tcMar>
+          </w:tcPr>
+          <w:p>
+            <w:pPr>
+              <w:spacing w:before="0" w:after="0" w:line="276" w:lineRule="auto"/>
+            </w:pPr>
+            <w:r>
+              <w:rPr>
+                <w:rFonts w:ascii="TH Sarabun New" w:hAnsi="TH Sarabun New"/>
+                <w:b w:val="0"/>
+                <w:i w:val="0"/>
+                <w:color w:val="1E293B"/>
+                <w:sz w:val="29"/>
+                <w:rFonts w:ascii="TH Sarabun New" w:hAnsi="TH Sarabun New" w:cs="TH Sarabun New"/>
+              </w:rPr>
+              <w:t>ทดสอบ /api/health/ ตรวจสอบความสมบูรณ์ของระบบและฐานข้อมูล</w:t>
             </w:r>
           </w:p>
         </w:tc>
@@ -11890,7 +12344,7 @@
                 <w:sz w:val="28"/>
                 <w:rFonts w:ascii="TH Sarabun New" w:hAnsi="TH Sarabun New" w:cs="TH Sarabun New"/>
               </w:rPr>
-              <w:t>[แทรกภาพ: ผลการรัน python manage.py test (Ran 4 tests in 5.4s ... OK)]</w:t>
+              <w:t>[แทรกภาพ: ผลการรัน python manage.py test (Ran 11 tests in 6.6s ... OK)]</w:t>
             </w:r>
           </w:p>
         </w:tc>
@@ -11910,7 +12364,7 @@
           <w:sz w:val="27"/>
           <w:rFonts w:ascii="TH Sarabun New" w:hAnsi="TH Sarabun New" w:cs="TH Sarabun New"/>
         </w:rPr>
-        <w:t>ภาพที่ 5.1 ผลการรันชุดทดสอบอัตโนมัติ</w:t>
+        <w:t>ภาพที่ 5.1 ผลการรันชุดทดสอบอัตโนมัติ 11 รายการ</w:t>
       </w:r>
     </w:p>
     <w:p>

</xml_diff>